<commit_message>
MS2 Interactive Trainer Final
</commit_message>
<xml_diff>
--- a/MahjongSensei_README_Milestone2.docx
+++ b/MahjongSensei_README_Milestone2.docx
@@ -4000,7 +4000,13 @@
       </w:r>
       <w:proofErr w:type="spellEnd"/>
       <w:r>
-        <w:t xml:space="preserve"> feature is unfinished. Current implementation is a basic proof of concept, while implementation of core game mechanics of claiming melds from discards, winning of discards, as well as game structure features like dealer and wind rotation, and AI behaviour for claiming melds of discards.</w:t>
+        <w:t xml:space="preserve"> feature is unfinished. Current implementation is a basic proof of concept, while implementation of core game mechanics of claiming melds from discards, winning o</w:t>
+      </w:r>
+      <w:r>
+        <w:t>f</w:t>
+      </w:r>
+      <w:r>
+        <w:t>f discards, as well as game structure features like dealer and wind rotation, and AI behaviour for claiming melds of discards.</w:t>
       </w:r>
     </w:p>
     <w:p>

</xml_diff>